<commit_message>
LaTeX equations, species italics, bib and font fixes, ENA/Zenodo accessions
</commit_message>
<xml_diff>
--- a/manuscript/Supplementary_Materials.docx
+++ b/manuscript/Supplementary_Materials.docx
@@ -51,18 +51,18 @@
           <wp:inline>
             <wp:extent cx="5334000" cy="4372596"/>
             <wp:effectExtent b="0" l="0" r="0" t="0"/>
-            <wp:docPr descr="" title="" id="21" name="Picture"/>
+            <wp:docPr descr="" title="" id="10" name="Picture"/>
             <a:graphic>
               <a:graphicData uri="http://schemas.openxmlformats.org/drawingml/2006/picture">
                 <pic:pic>
                   <pic:nvPicPr>
-                    <pic:cNvPr descr="../figures/FigureS1.png" id="22" name="Picture"/>
+                    <pic:cNvPr descr="../figures/FigureS1.png" id="11" name="Picture"/>
                     <pic:cNvPicPr>
                       <a:picLocks noChangeArrowheads="1" noChangeAspect="1"/>
                     </pic:cNvPicPr>
                   </pic:nvPicPr>
                   <pic:blipFill>
-                    <a:blip r:embed="rId20"/>
+                    <a:blip r:embed="rId9"/>
                     <a:stretch>
                       <a:fillRect/>
                     </a:stretch>
@@ -116,18 +116,18 @@
           <wp:inline>
             <wp:extent cx="5334000" cy="2040051"/>
             <wp:effectExtent b="0" l="0" r="0" t="0"/>
-            <wp:docPr descr="" title="" id="24" name="Picture"/>
+            <wp:docPr descr="" title="" id="13" name="Picture"/>
             <a:graphic>
               <a:graphicData uri="http://schemas.openxmlformats.org/drawingml/2006/picture">
                 <pic:pic>
                   <pic:nvPicPr>
-                    <pic:cNvPr descr="../figures/FigureS2.png" id="25" name="Picture"/>
+                    <pic:cNvPr descr="../figures/FigureS2.png" id="14" name="Picture"/>
                     <pic:cNvPicPr>
                       <a:picLocks noChangeArrowheads="1" noChangeAspect="1"/>
                     </pic:cNvPicPr>
                   </pic:nvPicPr>
                   <pic:blipFill>
-                    <a:blip r:embed="rId23"/>
+                    <a:blip r:embed="rId12"/>
                     <a:stretch>
                       <a:fillRect/>
                     </a:stretch>
@@ -181,18 +181,18 @@
           <wp:inline>
             <wp:extent cx="5334000" cy="2915064"/>
             <wp:effectExtent b="0" l="0" r="0" t="0"/>
-            <wp:docPr descr="" title="" id="27" name="Picture"/>
+            <wp:docPr descr="" title="" id="16" name="Picture"/>
             <a:graphic>
               <a:graphicData uri="http://schemas.openxmlformats.org/drawingml/2006/picture">
                 <pic:pic>
                   <pic:nvPicPr>
-                    <pic:cNvPr descr="../figures/FigureS3.png" id="28" name="Picture"/>
+                    <pic:cNvPr descr="../figures/FigureS3.png" id="17" name="Picture"/>
                     <pic:cNvPicPr>
                       <a:picLocks noChangeArrowheads="1" noChangeAspect="1"/>
                     </pic:cNvPicPr>
                   </pic:nvPicPr>
                   <pic:blipFill>
-                    <a:blip r:embed="rId26"/>
+                    <a:blip r:embed="rId15"/>
                     <a:stretch>
                       <a:fillRect/>
                     </a:stretch>
@@ -246,18 +246,18 @@
           <wp:inline>
             <wp:extent cx="5334000" cy="3692769"/>
             <wp:effectExtent b="0" l="0" r="0" t="0"/>
-            <wp:docPr descr="" title="" id="30" name="Picture"/>
+            <wp:docPr descr="" title="" id="19" name="Picture"/>
             <a:graphic>
               <a:graphicData uri="http://schemas.openxmlformats.org/drawingml/2006/picture">
                 <pic:pic>
                   <pic:nvPicPr>
-                    <pic:cNvPr descr="../figures/FigureS4.png" id="31" name="Picture"/>
+                    <pic:cNvPr descr="../figures/FigureS4.png" id="20" name="Picture"/>
                     <pic:cNvPicPr>
                       <a:picLocks noChangeArrowheads="1" noChangeAspect="1"/>
                     </pic:cNvPicPr>
                   </pic:nvPicPr>
                   <pic:blipFill>
-                    <a:blip r:embed="rId29"/>
+                    <a:blip r:embed="rId18"/>
                     <a:stretch>
                       <a:fillRect/>
                     </a:stretch>
@@ -311,18 +311,18 @@
           <wp:inline>
             <wp:extent cx="5334000" cy="3692769"/>
             <wp:effectExtent b="0" l="0" r="0" t="0"/>
-            <wp:docPr descr="" title="" id="33" name="Picture"/>
+            <wp:docPr descr="" title="" id="22" name="Picture"/>
             <a:graphic>
               <a:graphicData uri="http://schemas.openxmlformats.org/drawingml/2006/picture">
                 <pic:pic>
                   <pic:nvPicPr>
-                    <pic:cNvPr descr="../figures/FigureS5.png" id="34" name="Picture"/>
+                    <pic:cNvPr descr="../figures/FigureS5.png" id="23" name="Picture"/>
                     <pic:cNvPicPr>
                       <a:picLocks noChangeArrowheads="1" noChangeAspect="1"/>
                     </pic:cNvPicPr>
                   </pic:nvPicPr>
                   <pic:blipFill>
-                    <a:blip r:embed="rId32"/>
+                    <a:blip r:embed="rId21"/>
                     <a:stretch>
                       <a:fillRect/>
                     </a:stretch>
@@ -376,18 +376,18 @@
           <wp:inline>
             <wp:extent cx="5334000" cy="10073776"/>
             <wp:effectExtent b="0" l="0" r="0" t="0"/>
-            <wp:docPr descr="" title="" id="36" name="Picture"/>
+            <wp:docPr descr="" title="" id="25" name="Picture"/>
             <a:graphic>
               <a:graphicData uri="http://schemas.openxmlformats.org/drawingml/2006/picture">
                 <pic:pic>
                   <pic:nvPicPr>
-                    <pic:cNvPr descr="../figures/FigureS6.png" id="37" name="Picture"/>
+                    <pic:cNvPr descr="../figures/FigureS6.png" id="26" name="Picture"/>
                     <pic:cNvPicPr>
                       <a:picLocks noChangeArrowheads="1" noChangeAspect="1"/>
                     </pic:cNvPicPr>
                   </pic:nvPicPr>
                   <pic:blipFill>
-                    <a:blip r:embed="rId35"/>
+                    <a:blip r:embed="rId24"/>
                     <a:stretch>
                       <a:fillRect/>
                     </a:stretch>
@@ -441,18 +441,18 @@
           <wp:inline>
             <wp:extent cx="5334000" cy="13816755"/>
             <wp:effectExtent b="0" l="0" r="0" t="0"/>
-            <wp:docPr descr="" title="" id="39" name="Picture"/>
+            <wp:docPr descr="" title="" id="28" name="Picture"/>
             <a:graphic>
               <a:graphicData uri="http://schemas.openxmlformats.org/drawingml/2006/picture">
                 <pic:pic>
                   <pic:nvPicPr>
-                    <pic:cNvPr descr="../figures/FigureS7.png" id="40" name="Picture"/>
+                    <pic:cNvPr descr="../figures/FigureS7.png" id="29" name="Picture"/>
                     <pic:cNvPicPr>
                       <a:picLocks noChangeArrowheads="1" noChangeAspect="1"/>
                     </pic:cNvPicPr>
                   </pic:nvPicPr>
                   <pic:blipFill>
-                    <a:blip r:embed="rId38"/>
+                    <a:blip r:embed="rId27"/>
                     <a:stretch>
                       <a:fillRect/>
                     </a:stretch>
@@ -506,18 +506,18 @@
           <wp:inline>
             <wp:extent cx="5334000" cy="5444018"/>
             <wp:effectExtent b="0" l="0" r="0" t="0"/>
-            <wp:docPr descr="" title="" id="42" name="Picture"/>
+            <wp:docPr descr="" title="" id="31" name="Picture"/>
             <a:graphic>
               <a:graphicData uri="http://schemas.openxmlformats.org/drawingml/2006/picture">
                 <pic:pic>
                   <pic:nvPicPr>
-                    <pic:cNvPr descr="../figures/FigureS8.png" id="43" name="Picture"/>
+                    <pic:cNvPr descr="../figures/FigureS8.png" id="32" name="Picture"/>
                     <pic:cNvPicPr>
                       <a:picLocks noChangeArrowheads="1" noChangeAspect="1"/>
                     </pic:cNvPicPr>
                   </pic:nvPicPr>
                   <pic:blipFill>
-                    <a:blip r:embed="rId41"/>
+                    <a:blip r:embed="rId30"/>
                     <a:stretch>
                       <a:fillRect/>
                     </a:stretch>
@@ -571,18 +571,18 @@
           <wp:inline>
             <wp:extent cx="5334000" cy="1664207"/>
             <wp:effectExtent b="0" l="0" r="0" t="0"/>
-            <wp:docPr descr="" title="" id="45" name="Picture"/>
+            <wp:docPr descr="" title="" id="34" name="Picture"/>
             <a:graphic>
               <a:graphicData uri="http://schemas.openxmlformats.org/drawingml/2006/picture">
                 <pic:pic>
                   <pic:nvPicPr>
-                    <pic:cNvPr descr="../figures/FigureS9.png" id="46" name="Picture"/>
+                    <pic:cNvPr descr="../figures/FigureS9.png" id="35" name="Picture"/>
                     <pic:cNvPicPr>
                       <a:picLocks noChangeArrowheads="1" noChangeAspect="1"/>
                     </pic:cNvPicPr>
                   </pic:nvPicPr>
                   <pic:blipFill>
-                    <a:blip r:embed="rId44"/>
+                    <a:blip r:embed="rId33"/>
                     <a:stretch>
                       <a:fillRect/>
                     </a:stretch>
@@ -636,18 +636,18 @@
           <wp:inline>
             <wp:extent cx="5334000" cy="3487615"/>
             <wp:effectExtent b="0" l="0" r="0" t="0"/>
-            <wp:docPr descr="" title="" id="48" name="Picture"/>
+            <wp:docPr descr="" title="" id="37" name="Picture"/>
             <a:graphic>
               <a:graphicData uri="http://schemas.openxmlformats.org/drawingml/2006/picture">
                 <pic:pic>
                   <pic:nvPicPr>
-                    <pic:cNvPr descr="../figures/FigureS10.png" id="49" name="Picture"/>
+                    <pic:cNvPr descr="../figures/FigureS10.png" id="38" name="Picture"/>
                     <pic:cNvPicPr>
                       <a:picLocks noChangeArrowheads="1" noChangeAspect="1"/>
                     </pic:cNvPicPr>
                   </pic:nvPicPr>
                   <pic:blipFill>
-                    <a:blip r:embed="rId47"/>
+                    <a:blip r:embed="rId36"/>
                     <a:stretch>
                       <a:fillRect/>
                     </a:stretch>
@@ -701,18 +701,18 @@
           <wp:inline>
             <wp:extent cx="5334000" cy="4469528"/>
             <wp:effectExtent b="0" l="0" r="0" t="0"/>
-            <wp:docPr descr="" title="" id="51" name="Picture"/>
+            <wp:docPr descr="" title="" id="40" name="Picture"/>
             <a:graphic>
               <a:graphicData uri="http://schemas.openxmlformats.org/drawingml/2006/picture">
                 <pic:pic>
                   <pic:nvPicPr>
-                    <pic:cNvPr descr="../figures/FigureS11.png" id="52" name="Picture"/>
+                    <pic:cNvPr descr="../figures/FigureS11.png" id="41" name="Picture"/>
                     <pic:cNvPicPr>
                       <a:picLocks noChangeArrowheads="1" noChangeAspect="1"/>
                     </pic:cNvPicPr>
                   </pic:nvPicPr>
                   <pic:blipFill>
-                    <a:blip r:embed="rId50"/>
+                    <a:blip r:embed="rId39"/>
                     <a:stretch>
                       <a:fillRect/>
                     </a:stretch>
@@ -757,7 +757,11 @@
         <w:t xml:space="preserve">(A) Distribution of sequence-predicted melting temperatures (TemStaPro pseudo-T_m) for the 742 model enzymes; dashed lines mark the RNA-seq assay temperatures. (B) Temperature-dependent turnover predictions (DLTKcat): median and interquartile range of per-reaction log₁₀ k_cat across the 5–45 °C grid, with the azole target CYP51 (r_0317) highlighted. (C) The model-required AOX share of oxygen consumption against measured AOX transcript abundance (VST) across the six conditions (Spearman ρ = 0.99); point colour encodes temperature and marker shape dose. (D) Bayesian calibration of the four global enzyme parameters against the control TPC, shown as an identifiability analysis: emergent model (dashed), posterior median and 90% posterior-predictive band (solid line and shading), and measured growth (points). Only the melting-temperature shift is curve-constrained (−14.1 K, 90% CI −15.0 to −11.0, abutting the prior bound); the posterior sharpens the falling limb at the cost of the measured optimum and does not close the ~3-fold magnitude gap, so all downstream analyses use the uncalibrated model.</w:t>
       </w:r>
     </w:p>
-    <w:sectPr/>
+    <w:sectPr>
+      <w:footnotePr>
+        <w:numRestart w:val="eachSect"/>
+      </w:footnotePr>
+    </w:sectPr>
   </w:body>
 </w:document>
 </file>
@@ -874,10 +878,10 @@
   <w:docDefaults>
     <w:rPrDefault>
       <w:rPr>
-        <w:rFonts w:asciiTheme="minorHAnsi" w:cstheme="minorBidi" w:eastAsiaTheme="minorHAnsi" w:hAnsiTheme="minorHAnsi"/>
+        <w:rFonts w:asciiTheme="minorHAnsi" w:cstheme="minorBidi" w:eastAsiaTheme="minorEastAsia" w:hAnsiTheme="minorHAnsi"/>
         <w:sz w:val="24"/>
         <w:szCs w:val="24"/>
-        <w:lang w:bidi="ar-SA" w:eastAsia="en-US" w:val="en-US"/>
+        <w:lang w:bidi="ar-SA" w:eastAsia="zh-CN" w:val="en-US"/>
       </w:rPr>
     </w:rPrDefault>
     <w:pPrDefault>
@@ -929,8 +933,6 @@
     </w:pPr>
     <w:rPr>
       <w:rFonts w:asciiTheme="majorHAnsi" w:cstheme="majorBidi" w:eastAsiaTheme="majorEastAsia" w:hAnsiTheme="majorHAnsi"/>
-      <w:spacing w:val="-10"/>
-      <w:kern w:val="28"/>
       <w:sz w:val="56"/>
       <w:szCs w:val="56"/>
     </w:rPr>
@@ -943,8 +945,6 @@
     <w:rsid w:val="00A10FD9"/>
     <w:rPr>
       <w:rFonts w:asciiTheme="majorHAnsi" w:cstheme="majorBidi" w:eastAsiaTheme="majorEastAsia" w:hAnsiTheme="majorHAnsi"/>
-      <w:spacing w:val="-10"/>
-      <w:kern w:val="28"/>
       <w:sz w:val="56"/>
       <w:szCs w:val="56"/>
     </w:rPr>
@@ -985,23 +985,31 @@
   </w:style>
   <w:style w:customStyle="1" w:styleId="Author" w:type="paragraph">
     <w:name w:val="Author"/>
+    <w:basedOn w:val="Title"/>
     <w:next w:val="BodyText"/>
     <w:qFormat/>
     <w:pPr>
       <w:keepNext/>
       <w:keepLines/>
-      <w:jc w:val="center"/>
-    </w:pPr>
+    </w:pPr>
+    <w:rPr>
+      <w:sz w:val="24"/>
+      <w:szCs w:val="24"/>
+    </w:rPr>
   </w:style>
   <w:style w:styleId="Date" w:type="paragraph">
     <w:name w:val="Date"/>
+    <w:basedOn w:val="Title"/>
     <w:next w:val="BodyText"/>
     <w:qFormat/>
     <w:pPr>
       <w:keepNext/>
       <w:keepLines/>
-      <w:jc w:val="center"/>
-    </w:pPr>
+    </w:pPr>
+    <w:rPr>
+      <w:sz w:val="24"/>
+      <w:szCs w:val="24"/>
+    </w:rPr>
   </w:style>
   <w:style w:customStyle="1" w:styleId="AbstractTitle" w:type="paragraph">
     <w:name w:val="Abstract Title"/>
@@ -1414,13 +1422,6 @@
       </w:tblCellMar>
     </w:tblPr>
     <w:tblStylePr w:type="firstRow">
-      <w:tblPr>
-        <w:jc w:val="left"/>
-        <w:tblInd w:type="dxa" w:w="0"/>
-      </w:tblPr>
-      <w:trPr>
-        <w:jc w:val="left"/>
-      </w:trPr>
       <w:tcPr>
         <w:tcBorders>
           <w:bottom w:val="single"/>

</xml_diff>